<commit_message>
docs: BMI I Bob 1.1 kengaytirildi (~20 bet tayyor)
</commit_message>
<xml_diff>
--- a/docs/BMI/BMI_full.docx
+++ b/docs/BMI/BMI_full.docx
@@ -850,6 +850,1576 @@
         <w:br w:type="page"/>
       </w:r>
     </w:p>
+    <w:p>
+      <w:pPr>
+        <w:jc w:val="center"/>
+      </w:pPr>
+      <w:r>
+        <w:rPr>
+          <w:rFonts w:ascii="Times New Roman" w:hAnsi="Times New Roman"/>
+          <w:b/>
+          <w:sz w:val="32"/>
+        </w:rPr>
+        <w:t>I BOB. SMART STREET TIZIMIDA YORITISH TIZIMLARI</w:t>
+        <w:br/>
+        <w:t>TIZIMLI TAHLILI VA MASALANING QO'YILISHI</w:t>
+      </w:r>
+    </w:p>
+    <w:p/>
+    <w:p>
+      <w:r>
+        <w:rPr>
+          <w:rFonts w:ascii="Times New Roman" w:hAnsi="Times New Roman"/>
+          <w:b/>
+          <w:sz w:val="28"/>
+        </w:rPr>
+        <w:t>1.1. Smart Street tizimlarida energiya tejamkor yoritish tizimlari va ularning ahamiyati</w:t>
+      </w:r>
+    </w:p>
+    <w:p>
+      <w:r>
+        <w:rPr>
+          <w:rFonts w:ascii="Times New Roman" w:hAnsi="Times New Roman"/>
+          <w:b/>
+          <w:i/>
+          <w:sz w:val="28"/>
+        </w:rPr>
+        <w:t>1.1.1. Ko'cha yoritish tizimlarining hozirgi holati va muammolari</w:t>
+      </w:r>
+    </w:p>
+    <w:p>
+      <w:pPr>
+        <w:ind w:firstLine="709"/>
+      </w:pPr>
+      <w:r>
+        <w:rPr>
+          <w:rFonts w:ascii="Times New Roman" w:hAnsi="Times New Roman"/>
+          <w:sz w:val="28"/>
+        </w:rPr>
+        <w:t>Ko'cha yoritish tizimlari zamonaviy shahar infratuzilmasining ajralmas qismi hisoblanadi. Ular fuqarolarning xavfsizligini ta'minlash, transport harakatini tartibga solish, jinoyatchilikni oldini olish va shahar estetik ko'rinishini yaxshilash kabi muhim vazifalarni bajaradi. Jahon Bankining 2023-yildagi hisobotiga ko'ra, yaxshi yoritilgan ko'chalarda jinoyatchilik darajasi 20-30 foizga kamayadi [1]. Biroq, an'anaviy ko'cha yoritish tizimlari bir qator jiddiy muammolarga ega bo'lib, ularni hal qilish zamonaviy texnologiyalarni qo'llashni talab qiladi.</w:t>
+      </w:r>
+    </w:p>
+    <w:p>
+      <w:pPr>
+        <w:ind w:firstLine="709"/>
+      </w:pPr>
+      <w:r>
+        <w:rPr>
+          <w:rFonts w:ascii="Times New Roman" w:hAnsi="Times New Roman"/>
+          <w:sz w:val="28"/>
+        </w:rPr>
+        <w:t>Birinchi muammo — energiyaning behuda sarflanishi. An'anaviy tizimlar tun bo'yi (o'rtacha 10-12 soat) uzluksiz ishlaydi. Kuzatishlar shuni ko'rsatadiki, tun vaqtining 60-70 foizida ko'chalarda harakat deyarli kuzatilmaydi. Xalqaro Energetika Agentligi (IEA) ma'lumotlariga ko'ra, ko'cha yoritish dunyo elektr energiyasi iste'molining taxminan 3.19 foizini tashkil etadi, bu yiliga 320 TWh ga teng [6]. Agar bu energiyaning 70 foizi behuda sarflanayotgan bo'lsa, yiliga 224 TWh energiya isrof bo'lmoqda — bu butun O'zbekiston yillik energiya iste'molidan 3 marta ko'p.</w:t>
+      </w:r>
+    </w:p>
+    <w:p>
+      <w:pPr>
+        <w:ind w:firstLine="709"/>
+      </w:pPr>
+      <w:r>
+        <w:rPr>
+          <w:rFonts w:ascii="Times New Roman" w:hAnsi="Times New Roman"/>
+          <w:sz w:val="28"/>
+        </w:rPr>
+        <w:t>Ikkinchi muammo — eskirgan texnologiyalar. Ko'plab rivojlanayotgan mamlakatlarda, jumladan O'zbekistonda, ko'cha yoritish tizimlari hali ham eski texnologiyalarga asoslangan. Natriy lampalar (HPS — High Pressure Sodium) 70-150W quvvat sarflaydi va ishlash muddati 6000-10000 soat. LED lampalar esa 20-60W sarflab, 50000 soatgacha ishlaydi [7]. Ammo LED ga o'tish faqat muammoning bir qismini hal qiladi — agar LED ham tun bo'yi yonib tursa, energiya hali ham behuda sarflanadi.</w:t>
+      </w:r>
+    </w:p>
+    <w:p>
+      <w:pPr>
+        <w:ind w:firstLine="709"/>
+      </w:pPr>
+      <w:r>
+        <w:rPr>
+          <w:rFonts w:ascii="Times New Roman" w:hAnsi="Times New Roman"/>
+          <w:sz w:val="28"/>
+        </w:rPr>
+        <w:t>Uchinchi muammo — markazlashtirilgan boshqaruv yo'qligi. An'anaviy tizimlarda har bir yoritgich mustaqil ishlaydi yoki oddiy taymer bilan boshqariladi. Nosozliklarni aniqlash qo'lda amalga oshiriladi va ko'pincha bitta yoritgichning ishdan chiqishi bir necha hafta davomida aniqlanmay qoladi. Bu nafaqat xavfsizlik muammosi, balki texnik xizmat ko'rsatish xarajatlarini ham oshiradi.</w:t>
+      </w:r>
+    </w:p>
+    <w:p>
+      <w:pPr>
+        <w:ind w:firstLine="709"/>
+      </w:pPr>
+      <w:r>
+        <w:rPr>
+          <w:rFonts w:ascii="Times New Roman" w:hAnsi="Times New Roman"/>
+          <w:sz w:val="28"/>
+        </w:rPr>
+        <w:t>To'rtinchi muammo — ekologik ta'sir. Elektr energiyasi ishlab chiqarish jarayonida CO2 gazi chiqariladi. O'zbekistonda 1 kWh elektr energiyasi ishlab chiqarish uchun o'rtacha 0.6 kg CO2 chiqariladi [5]. Demak, ko'cha yoritish uchun sarflangan har bir ortiqcha kilovatt-soat atmosferaga qo'shimcha CO2 chiqarishga olib keladi.</w:t>
+      </w:r>
+    </w:p>
+    <w:p>
+      <w:pPr>
+        <w:ind w:firstLine="709"/>
+      </w:pPr>
+      <w:r>
+        <w:rPr>
+          <w:rFonts w:ascii="Times New Roman" w:hAnsi="Times New Roman"/>
+          <w:sz w:val="28"/>
+        </w:rPr>
+        <w:t>1.1-jadval. An'anaviy va aqlli yoritish tizimlarining qiyosiy tahlili</w:t>
+      </w:r>
+    </w:p>
+    <w:tbl>
+      <w:tblPr>
+        <w:tblStyle w:val="TableGrid"/>
+        <w:tblW w:type="auto" w:w="0"/>
+        <w:tblLook w:firstColumn="1" w:firstRow="1" w:lastColumn="0" w:lastRow="0" w:noHBand="0" w:noVBand="1" w:val="04A0"/>
+      </w:tblPr>
+      <w:tblGrid>
+        <w:gridCol w:w="2422"/>
+        <w:gridCol w:w="2422"/>
+        <w:gridCol w:w="2422"/>
+        <w:gridCol w:w="2422"/>
+      </w:tblGrid>
+      <w:tr>
+        <w:tc>
+          <w:tcPr>
+            <w:tcW w:type="dxa" w:w="2422"/>
+          </w:tcPr>
+          <w:p>
+            <w:r>
+              <w:t>Parametr</w:t>
+            </w:r>
+          </w:p>
+        </w:tc>
+        <w:tc>
+          <w:tcPr>
+            <w:tcW w:type="dxa" w:w="2422"/>
+          </w:tcPr>
+          <w:p>
+            <w:r>
+              <w:t>An'anaviy tizim</w:t>
+            </w:r>
+          </w:p>
+        </w:tc>
+        <w:tc>
+          <w:tcPr>
+            <w:tcW w:type="dxa" w:w="2422"/>
+          </w:tcPr>
+          <w:p>
+            <w:r>
+              <w:t>Aqlli tizim</w:t>
+            </w:r>
+          </w:p>
+        </w:tc>
+        <w:tc>
+          <w:tcPr>
+            <w:tcW w:type="dxa" w:w="2422"/>
+          </w:tcPr>
+          <w:p>
+            <w:r>
+              <w:t>Farq</w:t>
+            </w:r>
+          </w:p>
+        </w:tc>
+      </w:tr>
+      <w:tr>
+        <w:tc>
+          <w:tcPr>
+            <w:tcW w:type="dxa" w:w="2422"/>
+          </w:tcPr>
+          <w:p>
+            <w:r>
+              <w:t>Ishlash rejimi</w:t>
+            </w:r>
+          </w:p>
+        </w:tc>
+        <w:tc>
+          <w:tcPr>
+            <w:tcW w:type="dxa" w:w="2422"/>
+          </w:tcPr>
+          <w:p>
+            <w:r>
+              <w:t>Tun bo'yi uzluksiz (12h)</w:t>
+            </w:r>
+          </w:p>
+        </w:tc>
+        <w:tc>
+          <w:tcPr>
+            <w:tcW w:type="dxa" w:w="2422"/>
+          </w:tcPr>
+          <w:p>
+            <w:r>
+              <w:t>Faqat harakat vaqtida</w:t>
+            </w:r>
+          </w:p>
+        </w:tc>
+        <w:tc>
+          <w:tcPr>
+            <w:tcW w:type="dxa" w:w="2422"/>
+          </w:tcPr>
+          <w:p>
+            <w:r>
+              <w:t>—</w:t>
+            </w:r>
+          </w:p>
+        </w:tc>
+      </w:tr>
+      <w:tr>
+        <w:tc>
+          <w:tcPr>
+            <w:tcW w:type="dxa" w:w="2422"/>
+          </w:tcPr>
+          <w:p>
+            <w:r>
+              <w:t>Kunlik iste'mol (60W)</w:t>
+            </w:r>
+          </w:p>
+        </w:tc>
+        <w:tc>
+          <w:tcPr>
+            <w:tcW w:type="dxa" w:w="2422"/>
+          </w:tcPr>
+          <w:p>
+            <w:r>
+              <w:t>720 Wh</w:t>
+            </w:r>
+          </w:p>
+        </w:tc>
+        <w:tc>
+          <w:tcPr>
+            <w:tcW w:type="dxa" w:w="2422"/>
+          </w:tcPr>
+          <w:p>
+            <w:r>
+              <w:t>144 Wh</w:t>
+            </w:r>
+          </w:p>
+        </w:tc>
+        <w:tc>
+          <w:tcPr>
+            <w:tcW w:type="dxa" w:w="2422"/>
+          </w:tcPr>
+          <w:p>
+            <w:r>
+              <w:t>-80%</w:t>
+            </w:r>
+          </w:p>
+        </w:tc>
+      </w:tr>
+      <w:tr>
+        <w:tc>
+          <w:tcPr>
+            <w:tcW w:type="dxa" w:w="2422"/>
+          </w:tcPr>
+          <w:p>
+            <w:r>
+              <w:t>Oylik iste'mol</w:t>
+            </w:r>
+          </w:p>
+        </w:tc>
+        <w:tc>
+          <w:tcPr>
+            <w:tcW w:type="dxa" w:w="2422"/>
+          </w:tcPr>
+          <w:p>
+            <w:r>
+              <w:t>21.6 kWh</w:t>
+            </w:r>
+          </w:p>
+        </w:tc>
+        <w:tc>
+          <w:tcPr>
+            <w:tcW w:type="dxa" w:w="2422"/>
+          </w:tcPr>
+          <w:p>
+            <w:r>
+              <w:t>4.3 kWh</w:t>
+            </w:r>
+          </w:p>
+        </w:tc>
+        <w:tc>
+          <w:tcPr>
+            <w:tcW w:type="dxa" w:w="2422"/>
+          </w:tcPr>
+          <w:p>
+            <w:r>
+              <w:t>-80%</w:t>
+            </w:r>
+          </w:p>
+        </w:tc>
+      </w:tr>
+      <w:tr>
+        <w:tc>
+          <w:tcPr>
+            <w:tcW w:type="dxa" w:w="2422"/>
+          </w:tcPr>
+          <w:p>
+            <w:r>
+              <w:t>Yillik iste'mol</w:t>
+            </w:r>
+          </w:p>
+        </w:tc>
+        <w:tc>
+          <w:tcPr>
+            <w:tcW w:type="dxa" w:w="2422"/>
+          </w:tcPr>
+          <w:p>
+            <w:r>
+              <w:t>262.8 kWh</w:t>
+            </w:r>
+          </w:p>
+        </w:tc>
+        <w:tc>
+          <w:tcPr>
+            <w:tcW w:type="dxa" w:w="2422"/>
+          </w:tcPr>
+          <w:p>
+            <w:r>
+              <w:t>52.6 kWh</w:t>
+            </w:r>
+          </w:p>
+        </w:tc>
+        <w:tc>
+          <w:tcPr>
+            <w:tcW w:type="dxa" w:w="2422"/>
+          </w:tcPr>
+          <w:p>
+            <w:r>
+              <w:t>-80%</w:t>
+            </w:r>
+          </w:p>
+        </w:tc>
+      </w:tr>
+      <w:tr>
+        <w:tc>
+          <w:tcPr>
+            <w:tcW w:type="dxa" w:w="2422"/>
+          </w:tcPr>
+          <w:p>
+            <w:r>
+              <w:t>Yillik xarajat (500 so'm/kWh)</w:t>
+            </w:r>
+          </w:p>
+        </w:tc>
+        <w:tc>
+          <w:tcPr>
+            <w:tcW w:type="dxa" w:w="2422"/>
+          </w:tcPr>
+          <w:p>
+            <w:r>
+              <w:t>131,400 so'm</w:t>
+            </w:r>
+          </w:p>
+        </w:tc>
+        <w:tc>
+          <w:tcPr>
+            <w:tcW w:type="dxa" w:w="2422"/>
+          </w:tcPr>
+          <w:p>
+            <w:r>
+              <w:t>26,300 so'm</w:t>
+            </w:r>
+          </w:p>
+        </w:tc>
+        <w:tc>
+          <w:tcPr>
+            <w:tcW w:type="dxa" w:w="2422"/>
+          </w:tcPr>
+          <w:p>
+            <w:r>
+              <w:t>-105,100 so'm</w:t>
+            </w:r>
+          </w:p>
+        </w:tc>
+      </w:tr>
+      <w:tr>
+        <w:tc>
+          <w:tcPr>
+            <w:tcW w:type="dxa" w:w="2422"/>
+          </w:tcPr>
+          <w:p>
+            <w:r>
+              <w:t>CO2 emissiya (yiliga)</w:t>
+            </w:r>
+          </w:p>
+        </w:tc>
+        <w:tc>
+          <w:tcPr>
+            <w:tcW w:type="dxa" w:w="2422"/>
+          </w:tcPr>
+          <w:p>
+            <w:r>
+              <w:t>157.7 kg</w:t>
+            </w:r>
+          </w:p>
+        </w:tc>
+        <w:tc>
+          <w:tcPr>
+            <w:tcW w:type="dxa" w:w="2422"/>
+          </w:tcPr>
+          <w:p>
+            <w:r>
+              <w:t>31.5 kg</w:t>
+            </w:r>
+          </w:p>
+        </w:tc>
+        <w:tc>
+          <w:tcPr>
+            <w:tcW w:type="dxa" w:w="2422"/>
+          </w:tcPr>
+          <w:p>
+            <w:r>
+              <w:t>-126.2 kg</w:t>
+            </w:r>
+          </w:p>
+        </w:tc>
+      </w:tr>
+      <w:tr>
+        <w:tc>
+          <w:tcPr>
+            <w:tcW w:type="dxa" w:w="2422"/>
+          </w:tcPr>
+          <w:p>
+            <w:r>
+              <w:t>Xizmat muddati</w:t>
+            </w:r>
+          </w:p>
+        </w:tc>
+        <w:tc>
+          <w:tcPr>
+            <w:tcW w:type="dxa" w:w="2422"/>
+          </w:tcPr>
+          <w:p>
+            <w:r>
+              <w:t>6000-10000 soat</w:t>
+            </w:r>
+          </w:p>
+        </w:tc>
+        <w:tc>
+          <w:tcPr>
+            <w:tcW w:type="dxa" w:w="2422"/>
+          </w:tcPr>
+          <w:p>
+            <w:r>
+              <w:t>50000+ soat</w:t>
+            </w:r>
+          </w:p>
+        </w:tc>
+        <w:tc>
+          <w:tcPr>
+            <w:tcW w:type="dxa" w:w="2422"/>
+          </w:tcPr>
+          <w:p>
+            <w:r>
+              <w:t>5-8x</w:t>
+            </w:r>
+          </w:p>
+        </w:tc>
+      </w:tr>
+      <w:tr>
+        <w:tc>
+          <w:tcPr>
+            <w:tcW w:type="dxa" w:w="2422"/>
+          </w:tcPr>
+          <w:p>
+            <w:r>
+              <w:t>Nosozlik aniqlash</w:t>
+            </w:r>
+          </w:p>
+        </w:tc>
+        <w:tc>
+          <w:tcPr>
+            <w:tcW w:type="dxa" w:w="2422"/>
+          </w:tcPr>
+          <w:p>
+            <w:r>
+              <w:t>Qo'lda (kunlar)</w:t>
+            </w:r>
+          </w:p>
+        </w:tc>
+        <w:tc>
+          <w:tcPr>
+            <w:tcW w:type="dxa" w:w="2422"/>
+          </w:tcPr>
+          <w:p>
+            <w:r>
+              <w:t>Real-time (soniyalar)</w:t>
+            </w:r>
+          </w:p>
+        </w:tc>
+        <w:tc>
+          <w:tcPr>
+            <w:tcW w:type="dxa" w:w="2422"/>
+          </w:tcPr>
+          <w:p>
+            <w:r>
+              <w:t>—</w:t>
+            </w:r>
+          </w:p>
+        </w:tc>
+      </w:tr>
+    </w:tbl>
+    <w:p/>
+    <w:p>
+      <w:r>
+        <w:rPr>
+          <w:rFonts w:ascii="Times New Roman" w:hAnsi="Times New Roman"/>
+          <w:b/>
+          <w:i/>
+          <w:sz w:val="28"/>
+        </w:rPr>
+        <w:t>1.1.2. Smart Street (Aqlli ko'cha) konsepsiyasi va IoT texnologiyalari</w:t>
+      </w:r>
+    </w:p>
+    <w:p>
+      <w:pPr>
+        <w:ind w:firstLine="709"/>
+      </w:pPr>
+      <w:r>
+        <w:rPr>
+          <w:rFonts w:ascii="Times New Roman" w:hAnsi="Times New Roman"/>
+          <w:sz w:val="28"/>
+        </w:rPr>
+        <w:t>Smart Street — bu zamonaviy axborot-kommunikatsiya texnologiyalari, sensorlar va IoT qurilmalari yordamida ko'cha infratuzilmasini aqlli boshqarish konsepsiyasidir. Bu konsepsiya Smart City (Aqlli shahar) ning muhim tarkibiy qismi hisoblanadi va dunyo bo'ylab jadal rivojlanmoqda [8]. McKinsey Global Institute ning 2022-yildagi hisobotiga ko'ra, aqlli ko'cha yoritish tizimlari shaharlar uchun eng tez qoplanadigan IoT investitsiyalaridan biri bo'lib, o'rtacha 2-3 yilda o'zini oqlaydi.</w:t>
+      </w:r>
+    </w:p>
+    <w:p>
+      <w:pPr>
+        <w:ind w:firstLine="709"/>
+      </w:pPr>
+      <w:r>
+        <w:rPr>
+          <w:rFonts w:ascii="Times New Roman" w:hAnsi="Times New Roman"/>
+          <w:sz w:val="28"/>
+        </w:rPr>
+        <w:t>Aqlli ko'cha yoritish tizimi quyidagi asosiy komponentlardan iborat bo'lib, ularning har biri muhim vazifani bajaradi:</w:t>
+      </w:r>
+    </w:p>
+    <w:p>
+      <w:pPr>
+        <w:ind w:firstLine="709"/>
+      </w:pPr>
+      <w:r>
+        <w:rPr>
+          <w:rFonts w:ascii="Times New Roman" w:hAnsi="Times New Roman"/>
+          <w:sz w:val="28"/>
+        </w:rPr>
+        <w:t>1) Sensorlar qatlami (Perception Layer) — bu qatlam atrof-muhit haqida ma'lumot yig'adi. Harakatni aniqlash uchun ultratovush, PIR yoki radar sensorlari, yorug'lik darajasini o'lchash uchun fotorezistorlar yoki ambient light sensorlari, ob-havo sharoitlarini kuzatish uchun harorat va namlik sensorlari ishlatiladi. Bizning tizimimizda RCWL-9610A ultratovush sensori va TEMT6000 yorug'lik sensori ishlatiladi.</w:t>
+      </w:r>
+    </w:p>
+    <w:p>
+      <w:pPr>
+        <w:ind w:firstLine="709"/>
+      </w:pPr>
+      <w:r>
+        <w:rPr>
+          <w:rFonts w:ascii="Times New Roman" w:hAnsi="Times New Roman"/>
+          <w:sz w:val="28"/>
+        </w:rPr>
+        <w:t>2) Boshqaruv qatlami (Processing Layer) — mikrokontrollerlar yordamida sensorlardan olingan ma'lumotlarni qayta ishlash va qaror qabul qilish. ESP32 mikrokontrolleri bu vazifani bajaradi — u sensorlardan ma'lumot o'qiydi, algoritmlar asosida qaror qabul qiladi (yoqish/o'chirish) va natijani relay orqali amalga oshiradi.</w:t>
+      </w:r>
+    </w:p>
+    <w:p>
+      <w:pPr>
+        <w:ind w:firstLine="709"/>
+      </w:pPr>
+      <w:r>
+        <w:rPr>
+          <w:rFonts w:ascii="Times New Roman" w:hAnsi="Times New Roman"/>
+          <w:sz w:val="28"/>
+        </w:rPr>
+        <w:t>3) Aloqa qatlami (Network Layer) — WiFi, LoRa, Zigbee, NB-IoT yoki boshqa protokollar orqali ma'lumotlarni uzatish. Bizning tizimimizda WiFi (802.11 b/g/n) ishlatiladi, chunki u keng tarqalgan, tezkor va Firebase bilan integratsiya oson. ESP32 ning ichki WiFi moduli tashqi qurilma kerakligini bartaraf etadi.</w:t>
+      </w:r>
+    </w:p>
+    <w:p>
+      <w:pPr>
+        <w:ind w:firstLine="709"/>
+      </w:pPr>
+      <w:r>
+        <w:rPr>
+          <w:rFonts w:ascii="Times New Roman" w:hAnsi="Times New Roman"/>
+          <w:sz w:val="28"/>
+        </w:rPr>
+        <w:t>4) Bulutli qatlam (Cloud Layer) — ma'lumotlarni saqlash, tahlil qilish va masofadan boshqarish. Firebase Realtime Database real vaqt rejimida ma'lumot almashish imkonini beradi. Firebase ning afzalligi — u WebSocket protokoli orqali ishlaydi va ma'lumot o'zgarganda darhol barcha ulangan qurilmalarga xabar beradi (push model).</w:t>
+      </w:r>
+    </w:p>
+    <w:p>
+      <w:pPr>
+        <w:ind w:firstLine="709"/>
+      </w:pPr>
+      <w:r>
+        <w:rPr>
+          <w:rFonts w:ascii="Times New Roman" w:hAnsi="Times New Roman"/>
+          <w:sz w:val="28"/>
+        </w:rPr>
+        <w:t>5) Foydalanuvchi interfeysi (Application Layer) — veb yoki mobil ilova orqali monitoring va boshqarish. Bizning tizimimizda React asosida PWA (Progressive Web Application) yaratilgan bo'lib, u brauzerda ishlaydi, lekin native ilova kabi ko'rinadi va ishlaydi.</w:t>
+      </w:r>
+    </w:p>
+    <w:p>
+      <w:pPr>
+        <w:jc w:val="center"/>
+      </w:pPr>
+      <w:r>
+        <w:drawing>
+          <wp:inline xmlns:a="http://schemas.openxmlformats.org/drawingml/2006/main" xmlns:pic="http://schemas.openxmlformats.org/drawingml/2006/picture">
+            <wp:extent cx="5040000" cy="3780000"/>
+            <wp:docPr id="1" name="Picture 1"/>
+            <wp:cNvGraphicFramePr>
+              <a:graphicFrameLocks noChangeAspect="1"/>
+            </wp:cNvGraphicFramePr>
+            <a:graphic>
+              <a:graphicData uri="http://schemas.openxmlformats.org/drawingml/2006/picture">
+                <pic:pic>
+                  <pic:nvPicPr>
+                    <pic:cNvPr id="0" name="diagram_architecture.png"/>
+                    <pic:cNvPicPr/>
+                  </pic:nvPicPr>
+                  <pic:blipFill>
+                    <a:blip r:embed="rId9"/>
+                    <a:stretch>
+                      <a:fillRect/>
+                    </a:stretch>
+                  </pic:blipFill>
+                  <pic:spPr>
+                    <a:xfrm>
+                      <a:off x="0" y="0"/>
+                      <a:ext cx="5040000" cy="3780000"/>
+                    </a:xfrm>
+                    <a:prstGeom prst="rect"/>
+                  </pic:spPr>
+                </pic:pic>
+              </a:graphicData>
+            </a:graphic>
+          </wp:inline>
+        </w:drawing>
+      </w:r>
+    </w:p>
+    <w:p>
+      <w:pPr>
+        <w:jc w:val="center"/>
+      </w:pPr>
+      <w:r>
+        <w:rPr>
+          <w:rFonts w:ascii="Times New Roman" w:hAnsi="Times New Roman"/>
+          <w:i/>
+          <w:sz w:val="24"/>
+        </w:rPr>
+        <w:t>1.1-rasm. Aqlli ko'cha yoritish tizimining umumiy arxitekturasi</w:t>
+      </w:r>
+    </w:p>
+    <w:p>
+      <w:pPr>
+        <w:ind w:firstLine="709"/>
+      </w:pPr>
+      <w:r>
+        <w:rPr>
+          <w:rFonts w:ascii="Times New Roman" w:hAnsi="Times New Roman"/>
+          <w:sz w:val="28"/>
+        </w:rPr>
+        <w:t>1.1-rasmda tizimning umumiy arxitekturasi tasvirlangan. Ko'rinib turibdiki, ESP32 mikrokontrolleri markaziy element bo'lib, u bir tomondan sensorlar bilan, ikkinchi tomondan Firebase bulutli xizmati bilan bog'langan. Dashboard esa Firebase orqali ESP32 bilan real vaqt rejimida aloqa qiladi.</w:t>
+      </w:r>
+    </w:p>
+    <w:p>
+      <w:r>
+        <w:rPr>
+          <w:rFonts w:ascii="Times New Roman" w:hAnsi="Times New Roman"/>
+          <w:b/>
+          <w:i/>
+          <w:sz w:val="28"/>
+        </w:rPr>
+        <w:t>1.1.3. Energiya tejamkorlik yondashuvlari va ularning samaradorligi</w:t>
+      </w:r>
+    </w:p>
+    <w:p>
+      <w:pPr>
+        <w:ind w:firstLine="709"/>
+      </w:pPr>
+      <w:r>
+        <w:rPr>
+          <w:rFonts w:ascii="Times New Roman" w:hAnsi="Times New Roman"/>
+          <w:sz w:val="28"/>
+        </w:rPr>
+        <w:t>Ko'cha yoritish sohasida energiya tejamkorlikni ta'minlashning bir nechta yondashuvlari mavjud. Har bir yondashuv o'ziga xos afzallik va kamchiliklarga ega [9]:</w:t>
+      </w:r>
+    </w:p>
+    <w:p>
+      <w:pPr>
+        <w:ind w:firstLine="709"/>
+      </w:pPr>
+      <w:r>
+        <w:rPr>
+          <w:rFonts w:ascii="Times New Roman" w:hAnsi="Times New Roman"/>
+          <w:sz w:val="28"/>
+        </w:rPr>
+        <w:t>1) LED texnologiyasiga o'tish — eng oddiy va keng tarqalgan yondashuv. LED lampalar an'anaviy natriy lampalarga nisbatan 50-70% kam energiya sarflaydi va 5-8 marta uzoqroq ishlaydi. Biroq, LED ham tun bo'yi yonib tursa, energiya hali ham behuda sarflanadi. Bu yondashuv faqat lamp turini o'zgartiradi, boshqaruv logikasini emas.</w:t>
+      </w:r>
+    </w:p>
+    <w:p>
+      <w:pPr>
+        <w:ind w:firstLine="709"/>
+      </w:pPr>
+      <w:r>
+        <w:rPr>
+          <w:rFonts w:ascii="Times New Roman" w:hAnsi="Times New Roman"/>
+          <w:sz w:val="28"/>
+        </w:rPr>
+        <w:t>2) Dimming (yorug'lik darajasini pasaytirish) — tunda harakat kam bo'lgan vaqtlarda yorug'likni 30-50% ga pasaytirish. Bu yondashuv 20-40% energiya tejash imkonini beradi. Biroq, dimming uchun maxsus drayverlar kerak va u faqat LED lampalar bilan ishlaydi. Bundan tashqari, yorug'likni pasaytirish xavfsizlik muammolarini keltirib chiqarishi mumkin.</w:t>
+      </w:r>
+    </w:p>
+    <w:p>
+      <w:pPr>
+        <w:ind w:firstLine="709"/>
+      </w:pPr>
+      <w:r>
+        <w:rPr>
+          <w:rFonts w:ascii="Times New Roman" w:hAnsi="Times New Roman"/>
+          <w:sz w:val="28"/>
+        </w:rPr>
+        <w:t>3) Sensorli boshqaruv — harakat sensorlari yordamida faqat kerak bo'lganda yoqish. Bu eng samarali yondashuv bo'lib, 60-80% energiya tejash imkonini beradi. Sensor harakat aniqlasa — yoritgich yonadi, harakat to'xtasa — ma'lum vaqtdan keyin o'chadi. Bu yondashuv bizning loyihamizda asosiy usul sifatida tanlangan.</w:t>
+      </w:r>
+    </w:p>
+    <w:p>
+      <w:pPr>
+        <w:ind w:firstLine="709"/>
+      </w:pPr>
+      <w:r>
+        <w:rPr>
+          <w:rFonts w:ascii="Times New Roman" w:hAnsi="Times New Roman"/>
+          <w:sz w:val="28"/>
+        </w:rPr>
+        <w:t>4) Jadval bo'yicha boshqarish — vaqt jadvaliga asosan yoqish/o'chirish. Masalan, 22:00 dan 06:00 gacha yoniq, qolgan vaqtda o'chiq. Bu oddiy, lekin samarasiz — chunki tunda ham harakat bo'lmagan vaqtlarda yonib turadi.</w:t>
+      </w:r>
+    </w:p>
+    <w:p>
+      <w:pPr>
+        <w:ind w:firstLine="709"/>
+      </w:pPr>
+      <w:r>
+        <w:rPr>
+          <w:rFonts w:ascii="Times New Roman" w:hAnsi="Times New Roman"/>
+          <w:sz w:val="28"/>
+        </w:rPr>
+        <w:t>5) Adaptiv boshqaruv — sun'iy intellekt va machine learning yordamida harakat naqshlarini o'rganish va bashorat qilish. Bu eng murakkab va qimmat yondashuv bo'lib, katta miqyosli loyihalar uchun mos.</w:t>
+      </w:r>
+    </w:p>
+    <w:p>
+      <w:pPr>
+        <w:ind w:firstLine="709"/>
+      </w:pPr>
+      <w:r>
+        <w:rPr>
+          <w:rFonts w:ascii="Times New Roman" w:hAnsi="Times New Roman"/>
+          <w:sz w:val="28"/>
+        </w:rPr>
+        <w:t>1.2-jadval. Energiya tejamkorlik yondashuvlarining qiyosiy tahlili</w:t>
+      </w:r>
+    </w:p>
+    <w:tbl>
+      <w:tblPr>
+        <w:tblStyle w:val="TableGrid"/>
+        <w:tblW w:type="auto" w:w="0"/>
+        <w:tblLook w:firstColumn="1" w:firstRow="1" w:lastColumn="0" w:lastRow="0" w:noHBand="0" w:noVBand="1" w:val="04A0"/>
+      </w:tblPr>
+      <w:tblGrid>
+        <w:gridCol w:w="1938"/>
+        <w:gridCol w:w="1938"/>
+        <w:gridCol w:w="1938"/>
+        <w:gridCol w:w="1938"/>
+        <w:gridCol w:w="1938"/>
+      </w:tblGrid>
+      <w:tr>
+        <w:tc>
+          <w:tcPr>
+            <w:tcW w:type="dxa" w:w="1938"/>
+          </w:tcPr>
+          <w:p>
+            <w:r>
+              <w:t>Yondashuv</w:t>
+            </w:r>
+          </w:p>
+        </w:tc>
+        <w:tc>
+          <w:tcPr>
+            <w:tcW w:type="dxa" w:w="1938"/>
+          </w:tcPr>
+          <w:p>
+            <w:r>
+              <w:t>Tejash %</w:t>
+            </w:r>
+          </w:p>
+        </w:tc>
+        <w:tc>
+          <w:tcPr>
+            <w:tcW w:type="dxa" w:w="1938"/>
+          </w:tcPr>
+          <w:p>
+            <w:r>
+              <w:t>Murakkablik</w:t>
+            </w:r>
+          </w:p>
+        </w:tc>
+        <w:tc>
+          <w:tcPr>
+            <w:tcW w:type="dxa" w:w="1938"/>
+          </w:tcPr>
+          <w:p>
+            <w:r>
+              <w:t>Narx</w:t>
+            </w:r>
+          </w:p>
+        </w:tc>
+        <w:tc>
+          <w:tcPr>
+            <w:tcW w:type="dxa" w:w="1938"/>
+          </w:tcPr>
+          <w:p>
+            <w:r>
+              <w:t>Bizning tizim</w:t>
+            </w:r>
+          </w:p>
+        </w:tc>
+      </w:tr>
+      <w:tr>
+        <w:tc>
+          <w:tcPr>
+            <w:tcW w:type="dxa" w:w="1938"/>
+          </w:tcPr>
+          <w:p>
+            <w:r>
+              <w:t>LED ga o'tish</w:t>
+            </w:r>
+          </w:p>
+        </w:tc>
+        <w:tc>
+          <w:tcPr>
+            <w:tcW w:type="dxa" w:w="1938"/>
+          </w:tcPr>
+          <w:p>
+            <w:r>
+              <w:t>50-70%</w:t>
+            </w:r>
+          </w:p>
+        </w:tc>
+        <w:tc>
+          <w:tcPr>
+            <w:tcW w:type="dxa" w:w="1938"/>
+          </w:tcPr>
+          <w:p>
+            <w:r>
+              <w:t>Past</w:t>
+            </w:r>
+          </w:p>
+        </w:tc>
+        <w:tc>
+          <w:tcPr>
+            <w:tcW w:type="dxa" w:w="1938"/>
+          </w:tcPr>
+          <w:p>
+            <w:r>
+              <w:t>O'rtacha</w:t>
+            </w:r>
+          </w:p>
+        </w:tc>
+        <w:tc>
+          <w:tcPr>
+            <w:tcW w:type="dxa" w:w="1938"/>
+          </w:tcPr>
+          <w:p>
+            <w:r>
+              <w:t>Ha (LED lamp)</w:t>
+            </w:r>
+          </w:p>
+        </w:tc>
+      </w:tr>
+      <w:tr>
+        <w:tc>
+          <w:tcPr>
+            <w:tcW w:type="dxa" w:w="1938"/>
+          </w:tcPr>
+          <w:p>
+            <w:r>
+              <w:t>Dimming</w:t>
+            </w:r>
+          </w:p>
+        </w:tc>
+        <w:tc>
+          <w:tcPr>
+            <w:tcW w:type="dxa" w:w="1938"/>
+          </w:tcPr>
+          <w:p>
+            <w:r>
+              <w:t>20-40%</w:t>
+            </w:r>
+          </w:p>
+        </w:tc>
+        <w:tc>
+          <w:tcPr>
+            <w:tcW w:type="dxa" w:w="1938"/>
+          </w:tcPr>
+          <w:p>
+            <w:r>
+              <w:t>O'rtacha</w:t>
+            </w:r>
+          </w:p>
+        </w:tc>
+        <w:tc>
+          <w:tcPr>
+            <w:tcW w:type="dxa" w:w="1938"/>
+          </w:tcPr>
+          <w:p>
+            <w:r>
+              <w:t>O'rtacha</w:t>
+            </w:r>
+          </w:p>
+        </w:tc>
+        <w:tc>
+          <w:tcPr>
+            <w:tcW w:type="dxa" w:w="1938"/>
+          </w:tcPr>
+          <w:p>
+            <w:r>
+              <w:t>Yo'q</w:t>
+            </w:r>
+          </w:p>
+        </w:tc>
+      </w:tr>
+      <w:tr>
+        <w:tc>
+          <w:tcPr>
+            <w:tcW w:type="dxa" w:w="1938"/>
+          </w:tcPr>
+          <w:p>
+            <w:r>
+              <w:t>Sensorli boshqaruv</w:t>
+            </w:r>
+          </w:p>
+        </w:tc>
+        <w:tc>
+          <w:tcPr>
+            <w:tcW w:type="dxa" w:w="1938"/>
+          </w:tcPr>
+          <w:p>
+            <w:r>
+              <w:t>60-80%</w:t>
+            </w:r>
+          </w:p>
+        </w:tc>
+        <w:tc>
+          <w:tcPr>
+            <w:tcW w:type="dxa" w:w="1938"/>
+          </w:tcPr>
+          <w:p>
+            <w:r>
+              <w:t>O'rtacha</w:t>
+            </w:r>
+          </w:p>
+        </w:tc>
+        <w:tc>
+          <w:tcPr>
+            <w:tcW w:type="dxa" w:w="1938"/>
+          </w:tcPr>
+          <w:p>
+            <w:r>
+              <w:t>Past</w:t>
+            </w:r>
+          </w:p>
+        </w:tc>
+        <w:tc>
+          <w:tcPr>
+            <w:tcW w:type="dxa" w:w="1938"/>
+          </w:tcPr>
+          <w:p>
+            <w:r>
+              <w:t>Ha (asosiy)</w:t>
+            </w:r>
+          </w:p>
+        </w:tc>
+      </w:tr>
+      <w:tr>
+        <w:tc>
+          <w:tcPr>
+            <w:tcW w:type="dxa" w:w="1938"/>
+          </w:tcPr>
+          <w:p>
+            <w:r>
+              <w:t>Jadval</w:t>
+            </w:r>
+          </w:p>
+        </w:tc>
+        <w:tc>
+          <w:tcPr>
+            <w:tcW w:type="dxa" w:w="1938"/>
+          </w:tcPr>
+          <w:p>
+            <w:r>
+              <w:t>30-50%</w:t>
+            </w:r>
+          </w:p>
+        </w:tc>
+        <w:tc>
+          <w:tcPr>
+            <w:tcW w:type="dxa" w:w="1938"/>
+          </w:tcPr>
+          <w:p>
+            <w:r>
+              <w:t>Past</w:t>
+            </w:r>
+          </w:p>
+        </w:tc>
+        <w:tc>
+          <w:tcPr>
+            <w:tcW w:type="dxa" w:w="1938"/>
+          </w:tcPr>
+          <w:p>
+            <w:r>
+              <w:t>Past</w:t>
+            </w:r>
+          </w:p>
+        </w:tc>
+        <w:tc>
+          <w:tcPr>
+            <w:tcW w:type="dxa" w:w="1938"/>
+          </w:tcPr>
+          <w:p>
+            <w:r>
+              <w:t>Ha (qo'shimcha)</w:t>
+            </w:r>
+          </w:p>
+        </w:tc>
+      </w:tr>
+      <w:tr>
+        <w:tc>
+          <w:tcPr>
+            <w:tcW w:type="dxa" w:w="1938"/>
+          </w:tcPr>
+          <w:p>
+            <w:r>
+              <w:t>Adaptiv (AI)</w:t>
+            </w:r>
+          </w:p>
+        </w:tc>
+        <w:tc>
+          <w:tcPr>
+            <w:tcW w:type="dxa" w:w="1938"/>
+          </w:tcPr>
+          <w:p>
+            <w:r>
+              <w:t>70-85%</w:t>
+            </w:r>
+          </w:p>
+        </w:tc>
+        <w:tc>
+          <w:tcPr>
+            <w:tcW w:type="dxa" w:w="1938"/>
+          </w:tcPr>
+          <w:p>
+            <w:r>
+              <w:t>Yuqori</w:t>
+            </w:r>
+          </w:p>
+        </w:tc>
+        <w:tc>
+          <w:tcPr>
+            <w:tcW w:type="dxa" w:w="1938"/>
+          </w:tcPr>
+          <w:p>
+            <w:r>
+              <w:t>Yuqori</w:t>
+            </w:r>
+          </w:p>
+        </w:tc>
+        <w:tc>
+          <w:tcPr>
+            <w:tcW w:type="dxa" w:w="1938"/>
+          </w:tcPr>
+          <w:p>
+            <w:r>
+              <w:t>Yo'q</w:t>
+            </w:r>
+          </w:p>
+        </w:tc>
+      </w:tr>
+    </w:tbl>
+    <w:p/>
+    <w:p>
+      <w:r>
+        <w:rPr>
+          <w:rFonts w:ascii="Times New Roman" w:hAnsi="Times New Roman"/>
+          <w:b/>
+          <w:i/>
+          <w:sz w:val="28"/>
+        </w:rPr>
+        <w:t>1.1.4. Mavjud tijorat va akademik yechimlarning tahlili</w:t>
+      </w:r>
+    </w:p>
+    <w:p>
+      <w:pPr>
+        <w:ind w:firstLine="709"/>
+      </w:pPr>
+      <w:r>
+        <w:rPr>
+          <w:rFonts w:ascii="Times New Roman" w:hAnsi="Times New Roman"/>
+          <w:sz w:val="28"/>
+        </w:rPr>
+        <w:t>Dunyo miqyosida ko'cha yoritishni aqlli boshqarish bo'yicha bir qator tijorat va akademik loyihalar amalga oshirilgan. Ularni tahlil qilish bizning tizimimizning o'rnini aniqlash va afzalliklarini ko'rsatish uchun muhimdir.</w:t>
+      </w:r>
+    </w:p>
+    <w:p>
+      <w:pPr>
+        <w:ind w:firstLine="709"/>
+      </w:pPr>
+      <w:r>
+        <w:rPr>
+          <w:rFonts w:ascii="Times New Roman" w:hAnsi="Times New Roman"/>
+          <w:sz w:val="28"/>
+        </w:rPr>
+        <w:t>Philips CityTouch — Niderlandiyada Signify (avvalgi Philips Lighting) kompaniyasi tomonidan ishlab chiqilgan markazlashtirilgan boshqaruv tizimi. Har bir yoritgichga o'rnatilgan kontroller 4G/LTE tarmoq orqali markaziy serverga ulanadi. Tizim 30-40% energiya tejash imkonini beradi va 1000+ yoritgichni bir vaqtda boshqarish mumkin. Biroq, tizimning narxi juda yuqori — bitta yoritgich uchun $200-500 [11].</w:t>
+      </w:r>
+    </w:p>
+    <w:p>
+      <w:pPr>
+        <w:ind w:firstLine="709"/>
+      </w:pPr>
+      <w:r>
+        <w:rPr>
+          <w:rFonts w:ascii="Times New Roman" w:hAnsi="Times New Roman"/>
+          <w:sz w:val="28"/>
+        </w:rPr>
+        <w:t>Telensa — Buyuk Britaniyada ishlab chiqilgan tizim bo'lib, LoRa (Long Range) tarmoq protokoli orqali ishlaydi. Har bir yoritgichda PIR harakat sensori va yorug'lik sensori mavjud. Tizim 50-60% energiya tejashni ta'minlaydi va 10 km masofagacha aloqa qilish mumkin. Narxi o'rtacha — bitta yoritgich uchun $100-200 [12].</w:t>
+      </w:r>
+    </w:p>
+    <w:p>
+      <w:pPr>
+        <w:ind w:firstLine="709"/>
+      </w:pPr>
+      <w:r>
+        <w:rPr>
+          <w:rFonts w:ascii="Times New Roman" w:hAnsi="Times New Roman"/>
+          <w:sz w:val="28"/>
+        </w:rPr>
+        <w:t>Tvilight — Niderlandiyada ishlab chiqilgan tizim bo'lib, 24 GHz radar sensori yordamida harakatni aniqlaydi. Radar sensorining afzalligi — u piyodalar va transport vositalarini farqlash imkoniyatiga ega. Tizim 60-70% energiya tejash ko'rsatkichiga erishgan. Biroq, radar sensorining narxi yuqori ($50-100) [13].</w:t>
+      </w:r>
+    </w:p>
+    <w:p>
+      <w:pPr>
+        <w:ind w:firstLine="709"/>
+      </w:pPr>
+      <w:r>
+        <w:rPr>
+          <w:rFonts w:ascii="Times New Roman" w:hAnsi="Times New Roman"/>
+          <w:sz w:val="28"/>
+        </w:rPr>
+        <w:t>Arduino/ESP asosidagi ochiq kodli loyihalar — akademik va tadqiqot maqsadlarida yaratilgan turli prototiplar. Ular odatda PIR yoki ultratovush sensorlari bilan ishlaydi. Parkash va boshqalar (2016) tomonidan ishlab chiqilgan tizim HC-SR04 ultratovush sensori va Arduino Uno asosida qurilgan va 50-80% energiya tejash imkonini bergan [14]. Biroq, bu loyihalar odatda masofadan boshqarish va monitoring imkoniyatiga ega emas.</w:t>
+      </w:r>
+    </w:p>
+    <w:p>
+      <w:pPr>
+        <w:ind w:firstLine="709"/>
+      </w:pPr>
+      <w:r>
+        <w:rPr>
+          <w:rFonts w:ascii="Times New Roman" w:hAnsi="Times New Roman"/>
+          <w:sz w:val="28"/>
+        </w:rPr>
+        <w:t>1.3-jadval. Mavjud yechimlarning qiyosiy tahlili</w:t>
+      </w:r>
+    </w:p>
+    <w:tbl>
+      <w:tblPr>
+        <w:tblStyle w:val="TableGrid"/>
+        <w:tblW w:type="auto" w:w="0"/>
+        <w:tblLook w:firstColumn="1" w:firstRow="1" w:lastColumn="0" w:lastRow="0" w:noHBand="0" w:noVBand="1" w:val="04A0"/>
+      </w:tblPr>
+      <w:tblGrid>
+        <w:gridCol w:w="1615"/>
+        <w:gridCol w:w="1615"/>
+        <w:gridCol w:w="1615"/>
+        <w:gridCol w:w="1615"/>
+        <w:gridCol w:w="1615"/>
+        <w:gridCol w:w="1615"/>
+      </w:tblGrid>
+      <w:tr>
+        <w:tc>
+          <w:tcPr>
+            <w:tcW w:type="dxa" w:w="1615"/>
+          </w:tcPr>
+          <w:p>
+            <w:r>
+              <w:t>Tizim</w:t>
+            </w:r>
+          </w:p>
+        </w:tc>
+        <w:tc>
+          <w:tcPr>
+            <w:tcW w:type="dxa" w:w="1615"/>
+          </w:tcPr>
+          <w:p>
+            <w:r>
+              <w:t>Sensor</w:t>
+            </w:r>
+          </w:p>
+        </w:tc>
+        <w:tc>
+          <w:tcPr>
+            <w:tcW w:type="dxa" w:w="1615"/>
+          </w:tcPr>
+          <w:p>
+            <w:r>
+              <w:t>Aloqa</w:t>
+            </w:r>
+          </w:p>
+        </w:tc>
+        <w:tc>
+          <w:tcPr>
+            <w:tcW w:type="dxa" w:w="1615"/>
+          </w:tcPr>
+          <w:p>
+            <w:r>
+              <w:t>Tejash</w:t>
+            </w:r>
+          </w:p>
+        </w:tc>
+        <w:tc>
+          <w:tcPr>
+            <w:tcW w:type="dxa" w:w="1615"/>
+          </w:tcPr>
+          <w:p>
+            <w:r>
+              <w:t>Narx (1 ta)</w:t>
+            </w:r>
+          </w:p>
+        </w:tc>
+        <w:tc>
+          <w:tcPr>
+            <w:tcW w:type="dxa" w:w="1615"/>
+          </w:tcPr>
+          <w:p>
+            <w:r>
+              <w:t>Masofadan boshqarish</w:t>
+            </w:r>
+          </w:p>
+        </w:tc>
+      </w:tr>
+      <w:tr>
+        <w:tc>
+          <w:tcPr>
+            <w:tcW w:type="dxa" w:w="1615"/>
+          </w:tcPr>
+          <w:p>
+            <w:r>
+              <w:t>Philips CityTouch</w:t>
+            </w:r>
+          </w:p>
+        </w:tc>
+        <w:tc>
+          <w:tcPr>
+            <w:tcW w:type="dxa" w:w="1615"/>
+          </w:tcPr>
+          <w:p>
+            <w:r>
+              <w:t>PIR + Light</w:t>
+            </w:r>
+          </w:p>
+        </w:tc>
+        <w:tc>
+          <w:tcPr>
+            <w:tcW w:type="dxa" w:w="1615"/>
+          </w:tcPr>
+          <w:p>
+            <w:r>
+              <w:t>4G/LTE</w:t>
+            </w:r>
+          </w:p>
+        </w:tc>
+        <w:tc>
+          <w:tcPr>
+            <w:tcW w:type="dxa" w:w="1615"/>
+          </w:tcPr>
+          <w:p>
+            <w:r>
+              <w:t>30-40%</w:t>
+            </w:r>
+          </w:p>
+        </w:tc>
+        <w:tc>
+          <w:tcPr>
+            <w:tcW w:type="dxa" w:w="1615"/>
+          </w:tcPr>
+          <w:p>
+            <w:r>
+              <w:t>$200-500</w:t>
+            </w:r>
+          </w:p>
+        </w:tc>
+        <w:tc>
+          <w:tcPr>
+            <w:tcW w:type="dxa" w:w="1615"/>
+          </w:tcPr>
+          <w:p>
+            <w:r>
+              <w:t>Ha</w:t>
+            </w:r>
+          </w:p>
+        </w:tc>
+      </w:tr>
+      <w:tr>
+        <w:tc>
+          <w:tcPr>
+            <w:tcW w:type="dxa" w:w="1615"/>
+          </w:tcPr>
+          <w:p>
+            <w:r>
+              <w:t>Telensa</w:t>
+            </w:r>
+          </w:p>
+        </w:tc>
+        <w:tc>
+          <w:tcPr>
+            <w:tcW w:type="dxa" w:w="1615"/>
+          </w:tcPr>
+          <w:p>
+            <w:r>
+              <w:t>PIR + Light</w:t>
+            </w:r>
+          </w:p>
+        </w:tc>
+        <w:tc>
+          <w:tcPr>
+            <w:tcW w:type="dxa" w:w="1615"/>
+          </w:tcPr>
+          <w:p>
+            <w:r>
+              <w:t>LoRa</w:t>
+            </w:r>
+          </w:p>
+        </w:tc>
+        <w:tc>
+          <w:tcPr>
+            <w:tcW w:type="dxa" w:w="1615"/>
+          </w:tcPr>
+          <w:p>
+            <w:r>
+              <w:t>50-60%</w:t>
+            </w:r>
+          </w:p>
+        </w:tc>
+        <w:tc>
+          <w:tcPr>
+            <w:tcW w:type="dxa" w:w="1615"/>
+          </w:tcPr>
+          <w:p>
+            <w:r>
+              <w:t>$100-200</w:t>
+            </w:r>
+          </w:p>
+        </w:tc>
+        <w:tc>
+          <w:tcPr>
+            <w:tcW w:type="dxa" w:w="1615"/>
+          </w:tcPr>
+          <w:p>
+            <w:r>
+              <w:t>Ha</w:t>
+            </w:r>
+          </w:p>
+        </w:tc>
+      </w:tr>
+      <w:tr>
+        <w:tc>
+          <w:tcPr>
+            <w:tcW w:type="dxa" w:w="1615"/>
+          </w:tcPr>
+          <w:p>
+            <w:r>
+              <w:t>Tvilight</w:t>
+            </w:r>
+          </w:p>
+        </w:tc>
+        <w:tc>
+          <w:tcPr>
+            <w:tcW w:type="dxa" w:w="1615"/>
+          </w:tcPr>
+          <w:p>
+            <w:r>
+              <w:t>Radar 24GHz</w:t>
+            </w:r>
+          </w:p>
+        </w:tc>
+        <w:tc>
+          <w:tcPr>
+            <w:tcW w:type="dxa" w:w="1615"/>
+          </w:tcPr>
+          <w:p>
+            <w:r>
+              <w:t>WiFi</w:t>
+            </w:r>
+          </w:p>
+        </w:tc>
+        <w:tc>
+          <w:tcPr>
+            <w:tcW w:type="dxa" w:w="1615"/>
+          </w:tcPr>
+          <w:p>
+            <w:r>
+              <w:t>60-70%</w:t>
+            </w:r>
+          </w:p>
+        </w:tc>
+        <w:tc>
+          <w:tcPr>
+            <w:tcW w:type="dxa" w:w="1615"/>
+          </w:tcPr>
+          <w:p>
+            <w:r>
+              <w:t>$150-300</w:t>
+            </w:r>
+          </w:p>
+        </w:tc>
+        <w:tc>
+          <w:tcPr>
+            <w:tcW w:type="dxa" w:w="1615"/>
+          </w:tcPr>
+          <w:p>
+            <w:r>
+              <w:t>Ha</w:t>
+            </w:r>
+          </w:p>
+        </w:tc>
+      </w:tr>
+      <w:tr>
+        <w:tc>
+          <w:tcPr>
+            <w:tcW w:type="dxa" w:w="1615"/>
+          </w:tcPr>
+          <w:p>
+            <w:r>
+              <w:t>Parkash (2016)</w:t>
+            </w:r>
+          </w:p>
+        </w:tc>
+        <w:tc>
+          <w:tcPr>
+            <w:tcW w:type="dxa" w:w="1615"/>
+          </w:tcPr>
+          <w:p>
+            <w:r>
+              <w:t>HC-SR04</w:t>
+            </w:r>
+          </w:p>
+        </w:tc>
+        <w:tc>
+          <w:tcPr>
+            <w:tcW w:type="dxa" w:w="1615"/>
+          </w:tcPr>
+          <w:p>
+            <w:r>
+              <w:t>Yo'q</w:t>
+            </w:r>
+          </w:p>
+        </w:tc>
+        <w:tc>
+          <w:tcPr>
+            <w:tcW w:type="dxa" w:w="1615"/>
+          </w:tcPr>
+          <w:p>
+            <w:r>
+              <w:t>50-80%</w:t>
+            </w:r>
+          </w:p>
+        </w:tc>
+        <w:tc>
+          <w:tcPr>
+            <w:tcW w:type="dxa" w:w="1615"/>
+          </w:tcPr>
+          <w:p>
+            <w:r>
+              <w:t>$10-20</w:t>
+            </w:r>
+          </w:p>
+        </w:tc>
+        <w:tc>
+          <w:tcPr>
+            <w:tcW w:type="dxa" w:w="1615"/>
+          </w:tcPr>
+          <w:p>
+            <w:r>
+              <w:t>Yo'q</w:t>
+            </w:r>
+          </w:p>
+        </w:tc>
+      </w:tr>
+      <w:tr>
+        <w:tc>
+          <w:tcPr>
+            <w:tcW w:type="dxa" w:w="1615"/>
+          </w:tcPr>
+          <w:p>
+            <w:r>
+              <w:t>Bizning tizim</w:t>
+            </w:r>
+          </w:p>
+        </w:tc>
+        <w:tc>
+          <w:tcPr>
+            <w:tcW w:type="dxa" w:w="1615"/>
+          </w:tcPr>
+          <w:p>
+            <w:r>
+              <w:t>RCWL-9610A+TEMT6000</w:t>
+            </w:r>
+          </w:p>
+        </w:tc>
+        <w:tc>
+          <w:tcPr>
+            <w:tcW w:type="dxa" w:w="1615"/>
+          </w:tcPr>
+          <w:p>
+            <w:r>
+              <w:t>WiFi/Firebase</w:t>
+            </w:r>
+          </w:p>
+        </w:tc>
+        <w:tc>
+          <w:tcPr>
+            <w:tcW w:type="dxa" w:w="1615"/>
+          </w:tcPr>
+          <w:p>
+            <w:r>
+              <w:t>60-80%</w:t>
+            </w:r>
+          </w:p>
+        </w:tc>
+        <w:tc>
+          <w:tcPr>
+            <w:tcW w:type="dxa" w:w="1615"/>
+          </w:tcPr>
+          <w:p>
+            <w:r>
+              <w:t>$7-10</w:t>
+            </w:r>
+          </w:p>
+        </w:tc>
+        <w:tc>
+          <w:tcPr>
+            <w:tcW w:type="dxa" w:w="1615"/>
+          </w:tcPr>
+          <w:p>
+            <w:r>
+              <w:t>Ha (PWA)</w:t>
+            </w:r>
+          </w:p>
+        </w:tc>
+      </w:tr>
+    </w:tbl>
+    <w:p/>
+    <w:p>
+      <w:pPr>
+        <w:ind w:firstLine="709"/>
+      </w:pPr>
+      <w:r>
+        <w:rPr>
+          <w:rFonts w:ascii="Times New Roman" w:hAnsi="Times New Roman"/>
+          <w:sz w:val="28"/>
+        </w:rPr>
+        <w:t>Yuqoridagi tahlildan ko'rinib turibdiki, mavjud tijorat yechimlari yuqori narxga ega va ularni kichik miqyosda qo'llash iqtisodiy jihatdan samarasiz. Bizning tizimimiz esa arzon komponentlar (ESP32 ~$5, RCWL-9610A ~$1, TEMT6000 ~$0.5, Relay ~$1) asosida qurilgan bo'lib, jami narxi $7-10 ni tashkil etadi. Shu bilan birga, Firebase va PWA orqali masofadan boshqarish imkoniyati mavjud — bu tijorat yechimlaridek funksionallikni arzon narxda ta'minlaydi.</w:t>
+      </w:r>
+    </w:p>
+    <w:p>
+      <w:r>
+        <w:br w:type="page"/>
+      </w:r>
+    </w:p>
     <w:sectPr>
       <w:pgSz w:w="12240" w:h="15840"/>
       <w:pgMar w:top="1134" w:right="850" w:bottom="1134" w:left="1701" w:header="720" w:footer="720" w:gutter="0"/>

</xml_diff>